<commit_message>
fix: clarify NHS clinical-governance model as concept origin, not mandate (ROM1)
5.7 described the clinical governance framework as following "the same
core components described in the original NHS clinical-governance
model." Added a note that NABH's own ROM/COP standards already require
these components directly — the NHS model is cited only as the origin
of the concept, not an external authority the hospital must follow.

Co-Authored-By: Claude Sonnet 5 <noreply@anthropic.com>
Claude-Session: https://claude.ai/code/session_01TPRLtLhmTCP5z94Q3FiE5v
</commit_message>
<xml_diff>
--- a/policies/build/chapters_v2/ROM/Document/ROM_Package_v2/ROM1/SOP_ROM1_those_responsible_for_governance.docx
+++ b/policies/build/chapters_v2/ROM/Document/ROM_Package_v2/ROM1/SOP_ROM1_those_responsible_for_governance.docx
@@ -321,34 +321,22 @@
     </w:p>
     <w:p>
       <w:r>
-        <w:t xml:space="preserve">Governing Body: </w:t>
-      </w:r>
-      <w:r>
-        <w:t>makes and minutes the decisions this policy requires — approvals, appointments, resource allocation — and cannot delegate that accountability informally.</w:t>
+        <w:t xml:space="preserve">Governing Body: makes and minutes the decisions this policy requires — approvals, appointments, resource allocation — and cannot delegate that accountability informally.</w:t>
       </w:r>
     </w:p>
     <w:p>
       <w:r>
-        <w:t xml:space="preserve">Medical Superintendent / Person Heading the Organisation: </w:t>
-      </w:r>
-      <w:r>
-        <w:t>keeps the required documents current, prepares performance reports, and escalates anything not being done to the governing body.</w:t>
+        <w:t xml:space="preserve">Medical Superintendent / Person Heading the Organisation: keeps the required documents current, prepares performance reports, and escalates anything not being done to the governing body.</w:t>
       </w:r>
     </w:p>
     <w:p>
       <w:r>
-        <w:t xml:space="preserve">Quality Coordinator: </w:t>
-      </w:r>
-      <w:r>
-        <w:t>audits this policy periodically, checks records against the steps below, and flags gaps for corrective action.</w:t>
+        <w:t xml:space="preserve">Quality Coordinator: audits this policy periodically, checks records against the steps below, and flags gaps for corrective action.</w:t>
       </w:r>
     </w:p>
     <w:p>
       <w:r>
-        <w:t xml:space="preserve">Department Heads: </w:t>
-      </w:r>
-      <w:r>
-        <w:t>carry out the parts of this policy that apply within their own department and keep the department-level evidence current.</w:t>
+        <w:t xml:space="preserve">Department Heads: carry out the parts of this policy that apply within their own department and keep the department-level evidence current.</w:t>
       </w:r>
     </w:p>
     <w:p>
@@ -807,6 +795,14 @@
     </w:p>
     <w:p>
       <w:pPr>
+        <w:pStyle w:val="ListParagraph"/>
+      </w:pPr>
+      <w:r>
+        <w:t>Note: the Scally &amp; Donaldson model is cited as the origin of the clinical-governance concept, not as an external mandate. NABH’s own ROM/COP standards already require these same components — patient safety, clinical audit, pathways, indicators, education and research — so the governing requirement is NABH’s accreditation standards themselves; this framework simply ties them together under one accountable owner.</w:t>
+      </w:r>
+    </w:p>
+    <w:p>
+      <w:pPr>
         <w:pStyle w:val="Heading2"/>
       </w:pPr>
       <w:r>

</xml_diff>

<commit_message>
ROM: fix non-clickable NABH citation URL
Converted the NABH citation link in all 6 ROM files from plain text
containing a URL into a real clickable OOXML hyperlink. This closes
out the clickable-hyperlink fix across all affected chapters.

Co-Authored-By: Claude Sonnet 5 <noreply@anthropic.com>
Claude-Session: https://claude.ai/code/session_016VFLsECWt4VArpBiaqgrgF
</commit_message>
<xml_diff>
--- a/policies/build/chapters_v2/ROM/Document/ROM_Package_v2/ROM1/SOP_ROM1_those_responsible_for_governance.docx
+++ b/policies/build/chapters_v2/ROM/Document/ROM_Package_v2/ROM1/SOP_ROM1_those_responsible_for_governance.docx
@@ -1003,12 +1003,15 @@
       <w:pPr>
         <w:pStyle w:val="ListParagraph"/>
       </w:pPr>
-      <w:r>
-        <w:rPr>
-          <w:i/>
-        </w:rPr>
-        <w:t>National Accreditation Board for Hospitals and Healthcare Providers. (2025). NABH accreditation standards for hospitals (6th ed.), ROM.1. ISBN 978-81-965264-9-8. https://portal.nabh.co/images/Standards/NABH%20Hospital%20Accreditation%20Standard%206th%20Edition%20January%202025.pdf</w:t>
-      </w:r>
+      <w:hyperlink r:id="rId13">
+        <w:r>
+          <w:rPr>
+            <w:rStyle w:val="Hyperlink"/>
+            <w:i/>
+          </w:rPr>
+          <w:t>National Accreditation Board for Hospitals and Healthcare Providers. (2025). NABH accreditation standards for hospitals (6th ed.), ROM.1. ISBN 978-81-965264-9-8. https://portal.nabh.co/images/Standards/NABH%20Hospital%20Accreditation%20Standard%206th%20Edition%20January%202025.pdf</w:t>
+        </w:r>
+      </w:hyperlink>
     </w:p>
     <w:p>
       <w:pPr>

</xml_diff>